<commit_message>
Document creating and managing a discussion
Nine files said new-item offered five types, or named a discussion as
something you write by hand. The count, the exclusion list and the
troubleshooting transcript follow the code, the roadmap entry shrinks to
the two reference types still missing, and the tutorial's Discussion
section names the two ways to make one.

Regenerates the tutorial PDF and DOCX, which two of the edited pages are
part of.

Co-Authored-By: Claude Opus 5 (1M context) <noreply@anthropic.com>
</commit_message>
<xml_diff>
--- a/course/01-getting-started/_files/coursewright.docx
+++ b/course/01-getting-started/_files/coursewright.docx
@@ -15,7 +15,7 @@
         <w:pStyle w:val="Date"/>
       </w:pPr>
       <w:r>
-        <w:t xml:space="preserve">2026-08-31</w:t>
+        <w:t xml:space="preserve">2026-09-01</w:t>
       </w:r>
     </w:p>
     <w:sdt>
@@ -7765,6 +7765,51 @@
         <w:pStyle w:val="FirstParagraph"/>
       </w:pPr>
       <w:r>
+        <w:rPr>
+          <w:b/>
+          <w:bCs/>
+        </w:rPr>
+        <w:t xml:space="preserve">Course: New Item</w:t>
+      </w:r>
+      <w:r>
+        <w:t xml:space="preserve"> </w:t>
+      </w:r>
+      <w:r>
+        <w:t xml:space="preserve">creates one, and so does</w:t>
+      </w:r>
+      <w:r>
+        <w:t xml:space="preserve"> </w:t>
+      </w:r>
+      <w:r>
+        <w:rPr>
+          <w:rStyle w:val="VerbatimChar"/>
+        </w:rPr>
+        <w:t xml:space="preserve">npx course new-item --type discussion</w:t>
+      </w:r>
+      <w:r>
+        <w:t xml:space="preserve">. Both write the title and the</w:t>
+      </w:r>
+      <w:r>
+        <w:t xml:space="preserve"> </w:t>
+      </w:r>
+      <w:r>
+        <w:rPr>
+          <w:rStyle w:val="VerbatimChar"/>
+        </w:rPr>
+        <w:t xml:space="preserve">canvas_type</w:t>
+      </w:r>
+      <w:r>
+        <w:t xml:space="preserve"> </w:t>
+      </w:r>
+      <w:r>
+        <w:t xml:space="preserve">line; add the settings above yourself when you want them.</w:t>
+      </w:r>
+    </w:p>
+    <w:p>
+      <w:pPr>
+        <w:pStyle w:val="BodyText"/>
+      </w:pPr>
+      <w:r>
         <w:t xml:space="preserve">Replies stay in Canvas and never come back into your files. That does not put</w:t>
       </w:r>
       <w:r>
@@ -8507,19 +8552,19 @@
         <w:t xml:space="preserve"> </w:t>
       </w:r>
       <w:r>
-        <w:t xml:space="preserve">offer five types. A discussion,</w:t>
-      </w:r>
-      <w:r>
-        <w:t xml:space="preserve"> </w:t>
-      </w:r>
-      <w:r>
-        <w:t xml:space="preserve">a quiz and an external tool are the three they do not create: write the file</w:t>
-      </w:r>
-      <w:r>
-        <w:t xml:space="preserve"> </w:t>
-      </w:r>
-      <w:r>
-        <w:t xml:space="preserve">yourself with the frontmatter above, or copy an existing item and change its</w:t>
+        <w:t xml:space="preserve">offer six types. A quiz and an</w:t>
+      </w:r>
+      <w:r>
+        <w:t xml:space="preserve"> </w:t>
+      </w:r>
+      <w:r>
+        <w:t xml:space="preserve">external tool are the two they do not create: write the file yourself with the</w:t>
+      </w:r>
+      <w:r>
+        <w:t xml:space="preserve"> </w:t>
+      </w:r>
+      <w:r>
+        <w:t xml:space="preserve">frontmatter above, or copy an existing item and change its</w:t>
       </w:r>
       <w:r>
         <w:t xml:space="preserve"> </w:t>
@@ -8732,7 +8777,7 @@
         <w:t xml:space="preserve">Course: New Item</w:t>
       </w:r>
       <w:r>
-        <w:t xml:space="preserve">. It asks which of the five types it is and a name; an</w:t>
+        <w:t xml:space="preserve">. It asks which of the six types it is and a name; an</w:t>
       </w:r>
       <w:r>
         <w:t xml:space="preserve"> </w:t>

</xml_diff>